<commit_message>
SI tables cited in order of first citation; cover letter discloses related work
- every Online Resource 1 table is now cited in the text, numbered by first citation
- cover letter: the Zenodo deposit of the pre-rebuild version and the methods paper
  (in preparation for J. Chem. Inf. Model.) that uses this study as a case study

Co-Authored-By: Claude Opus 5.5 <noreply@anthropic.com>
</commit_message>
<xml_diff>
--- a/manuscript/submission/Cover_Letter_JMM.docx
+++ b/manuscript/submission/Cover_Letter_JMM.docx
@@ -45,7 +45,7 @@
       </w:pPr>
       <w:r>
         <w:rPr/>
-        <w:t>26 September 2026</w:t>
+        <w:t>27 September 2026</w:t>
       </w:r>
     </w:p>
     <w:p>
@@ -157,6 +157,15 @@
       <w:r>
         <w:rPr/>
         <w:t xml:space="preserve"> = 0.23).</w:t>
+      </w:r>
+    </w:p>
+    <w:p>
+      <w:pPr>
+        <w:jc w:val="both"/>
+      </w:pPr>
+      <w:r>
+        <w:rPr/>
+        <w:t>Related work. Supporting files of an earlier version of this study were deposited on Zenodo (https://doi.org/10.5281/zenodo.22700723); that version was superseded when the study was rebuilt from its raw inputs, and the results reported here replace it. A methods paper by the author, in preparation for the Journal of Chemical Information and Modeling, uses this study as one of four case studies of errors found and corrected during such rebuilds, and cites some of its summary numbers; the study is reported in full only in this manuscript.</w:t>
       </w:r>
     </w:p>
     <w:p>

</xml_diff>

<commit_message>
Submission prep: cover letters state the methods paper as submitted to J Comput Biophys Chem; AI-use statement read from manuscript/ai_statement.txt once the author approves it (draft in ai_statement_DRAFT.txt)
Co-Authored-By: Claude Opus 5.5 <noreply@anthropic.com>
</commit_message>
<xml_diff>
--- a/manuscript/submission/Cover_Letter_JMM.docx
+++ b/manuscript/submission/Cover_Letter_JMM.docx
@@ -45,7 +45,7 @@
       </w:pPr>
       <w:r>
         <w:rPr/>
-        <w:t>27 September 2026</w:t>
+        <w:t>29 September 2026</w:t>
       </w:r>
     </w:p>
     <w:p>
@@ -165,7 +165,7 @@
       </w:pPr>
       <w:r>
         <w:rPr/>
-        <w:t>Related work. Supporting files of an earlier version of this study were deposited on Zenodo (https://doi.org/10.5281/zenodo.22700723); that version was superseded when the study was rebuilt from its raw inputs, and the results reported here replace it. A methods paper by the author, in preparation, uses this study as one of four case studies of errors found and corrected during such rebuilds, and cites some of its summary numbers; the study is reported in full only in this manuscript.</w:t>
+        <w:t>Related work. Supporting files of an earlier version of this study were deposited on Zenodo (https://doi.org/10.5281/zenodo.22700723); that version was superseded when the study was rebuilt from its raw inputs, and the results reported here replace it. A methods paper by the author, submitted to the Journal of Computational Biophysics and Chemistry, uses this study as one of four case studies of errors found and corrected during such rebuilds, and cites some of its summary numbers; the study is reported in full only in this manuscript.</w:t>
       </w:r>
     </w:p>
     <w:p>

</xml_diff>